<commit_message>
Highlight GitHub repository link on the report front page
</commit_message>
<xml_diff>
--- a/docs/report.docx
+++ b/docs/report.docx
@@ -147,6 +147,36 @@
     </w:p>
     <w:p>
       <w:pPr>
+        <w:pBdr>
+          <w:top w:val="single" w:sz="8" w:space="4" w:color="000000"/>
+          <w:left w:val="single" w:sz="8" w:space="4" w:color="000000"/>
+          <w:bottom w:val="single" w:sz="8" w:space="4" w:color="000000"/>
+          <w:right w:val="single" w:sz="8" w:space="4" w:color="000000"/>
+        </w:pBdr>
+        <w:spacing w:before="280"/>
+        <w:jc w:val="center"/>
+      </w:pPr>
+      <w:r>
+        <w:rPr>
+          <w:b/>
+        </w:rPr>
+        <w:t>GitHub repository</w:t>
+      </w:r>
+      <w:r>
+        <w:br/>
+      </w:r>
+      <w:hyperlink r:id="rId9">
+        <w:r>
+          <w:rPr>
+            <w:b/>
+            <w:u w:val="single"/>
+          </w:rPr>
+          <w:t>https://github.com/anand-krishanu/AttractorField</w:t>
+        </w:r>
+      </w:hyperlink>
+    </w:p>
+    <w:p>
+      <w:pPr>
         <w:jc w:val="center"/>
       </w:pPr>
     </w:p>
@@ -251,7 +281,7 @@
       <w:r>
         <w:fldChar w:fldCharType="separate"/>
       </w:r>
-      <w:hyperlink w:anchor="_Toc242989744" w:history="1">
+      <w:hyperlink w:anchor="_Toc242989908" w:history="1">
         <w:r>
           <w:rPr>
             <w:rStyle w:val="Hyperlink"/>
@@ -278,7 +308,7 @@
             <w:noProof/>
             <w:webHidden/>
           </w:rPr>
-          <w:instrText xml:space="preserve"> PAGEREF _Toc242989744 \h </w:instrText>
+          <w:instrText xml:space="preserve"> PAGEREF _Toc242989908 \h </w:instrText>
         </w:r>
         <w:r>
           <w:rPr>
@@ -325,7 +355,7 @@
           <w14:ligatures w14:val="standardContextual"/>
         </w:rPr>
       </w:pPr>
-      <w:hyperlink w:anchor="_Toc242989745" w:history="1">
+      <w:hyperlink w:anchor="_Toc242989909" w:history="1">
         <w:r>
           <w:rPr>
             <w:rStyle w:val="Hyperlink"/>
@@ -352,7 +382,7 @@
             <w:noProof/>
             <w:webHidden/>
           </w:rPr>
-          <w:instrText xml:space="preserve"> PAGEREF _Toc242989745 \h </w:instrText>
+          <w:instrText xml:space="preserve"> PAGEREF _Toc242989909 \h </w:instrText>
         </w:r>
         <w:r>
           <w:rPr>
@@ -399,7 +429,7 @@
           <w14:ligatures w14:val="standardContextual"/>
         </w:rPr>
       </w:pPr>
-      <w:hyperlink w:anchor="_Toc242989746" w:history="1">
+      <w:hyperlink w:anchor="_Toc242989910" w:history="1">
         <w:r>
           <w:rPr>
             <w:rStyle w:val="Hyperlink"/>
@@ -426,7 +456,7 @@
             <w:noProof/>
             <w:webHidden/>
           </w:rPr>
-          <w:instrText xml:space="preserve"> PAGEREF _Toc242989746 \h </w:instrText>
+          <w:instrText xml:space="preserve"> PAGEREF _Toc242989910 \h </w:instrText>
         </w:r>
         <w:r>
           <w:rPr>
@@ -473,7 +503,7 @@
           <w14:ligatures w14:val="standardContextual"/>
         </w:rPr>
       </w:pPr>
-      <w:hyperlink w:anchor="_Toc242989747" w:history="1">
+      <w:hyperlink w:anchor="_Toc242989911" w:history="1">
         <w:r>
           <w:rPr>
             <w:rStyle w:val="Hyperlink"/>
@@ -500,7 +530,7 @@
             <w:noProof/>
             <w:webHidden/>
           </w:rPr>
-          <w:instrText xml:space="preserve"> PAGEREF _Toc242989747 \h </w:instrText>
+          <w:instrText xml:space="preserve"> PAGEREF _Toc242989911 \h </w:instrText>
         </w:r>
         <w:r>
           <w:rPr>
@@ -547,7 +577,7 @@
           <w14:ligatures w14:val="standardContextual"/>
         </w:rPr>
       </w:pPr>
-      <w:hyperlink w:anchor="_Toc242989748" w:history="1">
+      <w:hyperlink w:anchor="_Toc242989912" w:history="1">
         <w:r>
           <w:rPr>
             <w:rStyle w:val="Hyperlink"/>
@@ -574,7 +604,7 @@
             <w:noProof/>
             <w:webHidden/>
           </w:rPr>
-          <w:instrText xml:space="preserve"> PAGEREF _Toc242989748 \h </w:instrText>
+          <w:instrText xml:space="preserve"> PAGEREF _Toc242989912 \h </w:instrText>
         </w:r>
         <w:r>
           <w:rPr>
@@ -621,7 +651,7 @@
           <w14:ligatures w14:val="standardContextual"/>
         </w:rPr>
       </w:pPr>
-      <w:hyperlink w:anchor="_Toc242989749" w:history="1">
+      <w:hyperlink w:anchor="_Toc242989913" w:history="1">
         <w:r>
           <w:rPr>
             <w:rStyle w:val="Hyperlink"/>
@@ -648,7 +678,7 @@
             <w:noProof/>
             <w:webHidden/>
           </w:rPr>
-          <w:instrText xml:space="preserve"> PAGEREF _Toc242989749 \h </w:instrText>
+          <w:instrText xml:space="preserve"> PAGEREF _Toc242989913 \h </w:instrText>
         </w:r>
         <w:r>
           <w:rPr>
@@ -695,7 +725,7 @@
           <w14:ligatures w14:val="standardContextual"/>
         </w:rPr>
       </w:pPr>
-      <w:hyperlink w:anchor="_Toc242989750" w:history="1">
+      <w:hyperlink w:anchor="_Toc242989914" w:history="1">
         <w:r>
           <w:rPr>
             <w:rStyle w:val="Hyperlink"/>
@@ -722,7 +752,7 @@
             <w:noProof/>
             <w:webHidden/>
           </w:rPr>
-          <w:instrText xml:space="preserve"> PAGEREF _Toc242989750 \h </w:instrText>
+          <w:instrText xml:space="preserve"> PAGEREF _Toc242989914 \h </w:instrText>
         </w:r>
         <w:r>
           <w:rPr>
@@ -769,7 +799,7 @@
           <w14:ligatures w14:val="standardContextual"/>
         </w:rPr>
       </w:pPr>
-      <w:hyperlink w:anchor="_Toc242989751" w:history="1">
+      <w:hyperlink w:anchor="_Toc242989915" w:history="1">
         <w:r>
           <w:rPr>
             <w:rStyle w:val="Hyperlink"/>
@@ -796,7 +826,7 @@
             <w:noProof/>
             <w:webHidden/>
           </w:rPr>
-          <w:instrText xml:space="preserve"> PAGEREF _Toc242989751 \h </w:instrText>
+          <w:instrText xml:space="preserve"> PAGEREF _Toc242989915 \h </w:instrText>
         </w:r>
         <w:r>
           <w:rPr>
@@ -843,7 +873,7 @@
           <w14:ligatures w14:val="standardContextual"/>
         </w:rPr>
       </w:pPr>
-      <w:hyperlink w:anchor="_Toc242989752" w:history="1">
+      <w:hyperlink w:anchor="_Toc242989916" w:history="1">
         <w:r>
           <w:rPr>
             <w:rStyle w:val="Hyperlink"/>
@@ -870,7 +900,7 @@
             <w:noProof/>
             <w:webHidden/>
           </w:rPr>
-          <w:instrText xml:space="preserve"> PAGEREF _Toc242989752 \h </w:instrText>
+          <w:instrText xml:space="preserve"> PAGEREF _Toc242989916 \h </w:instrText>
         </w:r>
         <w:r>
           <w:rPr>
@@ -917,7 +947,7 @@
           <w14:ligatures w14:val="standardContextual"/>
         </w:rPr>
       </w:pPr>
-      <w:hyperlink w:anchor="_Toc242989753" w:history="1">
+      <w:hyperlink w:anchor="_Toc242989917" w:history="1">
         <w:r>
           <w:rPr>
             <w:rStyle w:val="Hyperlink"/>
@@ -944,7 +974,7 @@
             <w:noProof/>
             <w:webHidden/>
           </w:rPr>
-          <w:instrText xml:space="preserve"> PAGEREF _Toc242989753 \h </w:instrText>
+          <w:instrText xml:space="preserve"> PAGEREF _Toc242989917 \h </w:instrText>
         </w:r>
         <w:r>
           <w:rPr>
@@ -1018,7 +1048,7 @@
       <w:r>
         <w:fldChar w:fldCharType="separate"/>
       </w:r>
-      <w:hyperlink w:anchor="_Toc242989754" w:history="1">
+      <w:hyperlink w:anchor="_Toc242989918" w:history="1">
         <w:r>
           <w:rPr>
             <w:rStyle w:val="Hyperlink"/>
@@ -1045,7 +1075,7 @@
             <w:noProof/>
             <w:webHidden/>
           </w:rPr>
-          <w:instrText xml:space="preserve"> PAGEREF _Toc242989754 \h </w:instrText>
+          <w:instrText xml:space="preserve"> PAGEREF _Toc242989918 \h </w:instrText>
         </w:r>
         <w:r>
           <w:rPr>
@@ -1092,7 +1122,7 @@
           <w14:ligatures w14:val="standardContextual"/>
         </w:rPr>
       </w:pPr>
-      <w:hyperlink w:anchor="_Toc242989755" w:history="1">
+      <w:hyperlink w:anchor="_Toc242989919" w:history="1">
         <w:r>
           <w:rPr>
             <w:rStyle w:val="Hyperlink"/>
@@ -1119,7 +1149,7 @@
             <w:noProof/>
             <w:webHidden/>
           </w:rPr>
-          <w:instrText xml:space="preserve"> PAGEREF _Toc242989755 \h </w:instrText>
+          <w:instrText xml:space="preserve"> PAGEREF _Toc242989919 \h </w:instrText>
         </w:r>
         <w:r>
           <w:rPr>
@@ -1166,7 +1196,7 @@
           <w14:ligatures w14:val="standardContextual"/>
         </w:rPr>
       </w:pPr>
-      <w:hyperlink w:anchor="_Toc242989756" w:history="1">
+      <w:hyperlink w:anchor="_Toc242989920" w:history="1">
         <w:r>
           <w:rPr>
             <w:rStyle w:val="Hyperlink"/>
@@ -1193,7 +1223,7 @@
             <w:noProof/>
             <w:webHidden/>
           </w:rPr>
-          <w:instrText xml:space="preserve"> PAGEREF _Toc242989756 \h </w:instrText>
+          <w:instrText xml:space="preserve"> PAGEREF _Toc242989920 \h </w:instrText>
         </w:r>
         <w:r>
           <w:rPr>
@@ -1240,7 +1270,7 @@
           <w14:ligatures w14:val="standardContextual"/>
         </w:rPr>
       </w:pPr>
-      <w:hyperlink w:anchor="_Toc242989757" w:history="1">
+      <w:hyperlink w:anchor="_Toc242989921" w:history="1">
         <w:r>
           <w:rPr>
             <w:rStyle w:val="Hyperlink"/>
@@ -1267,7 +1297,7 @@
             <w:noProof/>
             <w:webHidden/>
           </w:rPr>
-          <w:instrText xml:space="preserve"> PAGEREF _Toc242989757 \h </w:instrText>
+          <w:instrText xml:space="preserve"> PAGEREF _Toc242989921 \h </w:instrText>
         </w:r>
         <w:r>
           <w:rPr>
@@ -1314,7 +1344,7 @@
           <w14:ligatures w14:val="standardContextual"/>
         </w:rPr>
       </w:pPr>
-      <w:hyperlink w:anchor="_Toc242989758" w:history="1">
+      <w:hyperlink w:anchor="_Toc242989922" w:history="1">
         <w:r>
           <w:rPr>
             <w:rStyle w:val="Hyperlink"/>
@@ -1341,7 +1371,7 @@
             <w:noProof/>
             <w:webHidden/>
           </w:rPr>
-          <w:instrText xml:space="preserve"> PAGEREF _Toc242989758 \h </w:instrText>
+          <w:instrText xml:space="preserve"> PAGEREF _Toc242989922 \h </w:instrText>
         </w:r>
         <w:r>
           <w:rPr>
@@ -1388,7 +1418,7 @@
           <w14:ligatures w14:val="standardContextual"/>
         </w:rPr>
       </w:pPr>
-      <w:hyperlink w:anchor="_Toc242989759" w:history="1">
+      <w:hyperlink w:anchor="_Toc242989923" w:history="1">
         <w:r>
           <w:rPr>
             <w:rStyle w:val="Hyperlink"/>
@@ -1415,7 +1445,7 @@
             <w:noProof/>
             <w:webHidden/>
           </w:rPr>
-          <w:instrText xml:space="preserve"> PAGEREF _Toc242989759 \h </w:instrText>
+          <w:instrText xml:space="preserve"> PAGEREF _Toc242989923 \h </w:instrText>
         </w:r>
         <w:r>
           <w:rPr>
@@ -1462,7 +1492,7 @@
           <w14:ligatures w14:val="standardContextual"/>
         </w:rPr>
       </w:pPr>
-      <w:hyperlink w:anchor="_Toc242989760" w:history="1">
+      <w:hyperlink w:anchor="_Toc242989924" w:history="1">
         <w:r>
           <w:rPr>
             <w:rStyle w:val="Hyperlink"/>
@@ -1489,7 +1519,7 @@
             <w:noProof/>
             <w:webHidden/>
           </w:rPr>
-          <w:instrText xml:space="preserve"> PAGEREF _Toc242989760 \h </w:instrText>
+          <w:instrText xml:space="preserve"> PAGEREF _Toc242989924 \h </w:instrText>
         </w:r>
         <w:r>
           <w:rPr>
@@ -1536,7 +1566,7 @@
           <w14:ligatures w14:val="standardContextual"/>
         </w:rPr>
       </w:pPr>
-      <w:hyperlink w:anchor="_Toc242989761" w:history="1">
+      <w:hyperlink w:anchor="_Toc242989925" w:history="1">
         <w:r>
           <w:rPr>
             <w:rStyle w:val="Hyperlink"/>
@@ -1563,7 +1593,7 @@
             <w:noProof/>
             <w:webHidden/>
           </w:rPr>
-          <w:instrText xml:space="preserve"> PAGEREF _Toc242989761 \h </w:instrText>
+          <w:instrText xml:space="preserve"> PAGEREF _Toc242989925 \h </w:instrText>
         </w:r>
         <w:r>
           <w:rPr>
@@ -1610,7 +1640,7 @@
           <w14:ligatures w14:val="standardContextual"/>
         </w:rPr>
       </w:pPr>
-      <w:hyperlink w:anchor="_Toc242989762" w:history="1">
+      <w:hyperlink w:anchor="_Toc242989926" w:history="1">
         <w:r>
           <w:rPr>
             <w:rStyle w:val="Hyperlink"/>
@@ -1637,7 +1667,7 @@
             <w:noProof/>
             <w:webHidden/>
           </w:rPr>
-          <w:instrText xml:space="preserve"> PAGEREF _Toc242989762 \h </w:instrText>
+          <w:instrText xml:space="preserve"> PAGEREF _Toc242989926 \h </w:instrText>
         </w:r>
         <w:r>
           <w:rPr>
@@ -1684,7 +1714,7 @@
           <w14:ligatures w14:val="standardContextual"/>
         </w:rPr>
       </w:pPr>
-      <w:hyperlink w:anchor="_Toc242989763" w:history="1">
+      <w:hyperlink w:anchor="_Toc242989927" w:history="1">
         <w:r>
           <w:rPr>
             <w:rStyle w:val="Hyperlink"/>
@@ -1711,7 +1741,7 @@
             <w:noProof/>
             <w:webHidden/>
           </w:rPr>
-          <w:instrText xml:space="preserve"> PAGEREF _Toc242989763 \h </w:instrText>
+          <w:instrText xml:space="preserve"> PAGEREF _Toc242989927 \h </w:instrText>
         </w:r>
         <w:r>
           <w:rPr>
@@ -1758,7 +1788,7 @@
           <w14:ligatures w14:val="standardContextual"/>
         </w:rPr>
       </w:pPr>
-      <w:hyperlink w:anchor="_Toc242989764" w:history="1">
+      <w:hyperlink w:anchor="_Toc242989928" w:history="1">
         <w:r>
           <w:rPr>
             <w:rStyle w:val="Hyperlink"/>
@@ -1785,7 +1815,7 @@
             <w:noProof/>
             <w:webHidden/>
           </w:rPr>
-          <w:instrText xml:space="preserve"> PAGEREF _Toc242989764 \h </w:instrText>
+          <w:instrText xml:space="preserve"> PAGEREF _Toc242989928 \h </w:instrText>
         </w:r>
         <w:r>
           <w:rPr>
@@ -1832,7 +1862,7 @@
           <w14:ligatures w14:val="standardContextual"/>
         </w:rPr>
       </w:pPr>
-      <w:hyperlink w:anchor="_Toc242989765" w:history="1">
+      <w:hyperlink w:anchor="_Toc242989929" w:history="1">
         <w:r>
           <w:rPr>
             <w:rStyle w:val="Hyperlink"/>
@@ -1859,7 +1889,7 @@
             <w:noProof/>
             <w:webHidden/>
           </w:rPr>
-          <w:instrText xml:space="preserve"> PAGEREF _Toc242989765 \h </w:instrText>
+          <w:instrText xml:space="preserve"> PAGEREF _Toc242989929 \h </w:instrText>
         </w:r>
         <w:r>
           <w:rPr>
@@ -1904,7 +1934,7 @@
       <w:pPr>
         <w:pStyle w:val="Heading1"/>
       </w:pPr>
-      <w:bookmarkStart w:id="0" w:name="_Toc242989744"/>
+      <w:bookmarkStart w:id="0" w:name="_Toc242989908"/>
       <w:r>
         <w:lastRenderedPageBreak/>
         <w:t>Abstract</w:t>
@@ -1928,7 +1958,7 @@
       <w:pPr>
         <w:pStyle w:val="Heading1"/>
       </w:pPr>
-      <w:bookmarkStart w:id="1" w:name="_Toc242989745"/>
+      <w:bookmarkStart w:id="1" w:name="_Toc242989909"/>
       <w:r>
         <w:t>1. Problem Definition</w:t>
       </w:r>
@@ -2023,7 +2053,7 @@
       <w:pPr>
         <w:pStyle w:val="Heading1"/>
       </w:pPr>
-      <w:bookmarkStart w:id="2" w:name="_Toc242989746"/>
+      <w:bookmarkStart w:id="2" w:name="_Toc242989910"/>
       <w:r>
         <w:t>2. Dataset</w:t>
       </w:r>
@@ -2046,7 +2076,7 @@
       <w:pPr>
         <w:pStyle w:val="Heading1"/>
       </w:pPr>
-      <w:bookmarkStart w:id="3" w:name="_Toc242989747"/>
+      <w:bookmarkStart w:id="3" w:name="_Toc242989911"/>
       <w:r>
         <w:lastRenderedPageBreak/>
         <w:t>3. Architecture &amp; Technologies</w:t>
@@ -2360,7 +2390,7 @@
       <w:pPr>
         <w:pStyle w:val="Heading1"/>
       </w:pPr>
-      <w:bookmarkStart w:id="4" w:name="_Toc242989748"/>
+      <w:bookmarkStart w:id="4" w:name="_Toc242989912"/>
       <w:r>
         <w:t>4. Methodology</w:t>
       </w:r>
@@ -3237,7 +3267,7 @@
       <w:pPr>
         <w:pStyle w:val="Heading1"/>
       </w:pPr>
-      <w:bookmarkStart w:id="5" w:name="_Toc242989749"/>
+      <w:bookmarkStart w:id="5" w:name="_Toc242989913"/>
       <w:r>
         <w:t>5. Results &amp; Analysis</w:t>
       </w:r>
@@ -3260,7 +3290,7 @@
           <w:noProof/>
         </w:rPr>
         <w:drawing>
-          <wp:inline distT="0" distB="0" distL="0" distR="0" wp14:anchorId="5380543E" wp14:editId="7D2CBB77">
+          <wp:inline distT="0" distB="0" distL="0" distR="0" wp14:anchorId="3F912C5A" wp14:editId="3F5F4798">
             <wp:extent cx="4389120" cy="1692946"/>
             <wp:effectExtent l="0" t="0" r="0" b="0"/>
             <wp:docPr id="973663801" name="Picture 973663801"/>
@@ -3272,63 +3302,6 @@
                 <pic:pic xmlns:pic="http://schemas.openxmlformats.org/drawingml/2006/picture">
                   <pic:nvPicPr>
                     <pic:cNvPr id="0" name="yearly.png"/>
-                    <pic:cNvPicPr/>
-                  </pic:nvPicPr>
-                  <pic:blipFill>
-                    <a:blip r:embed="rId9"/>
-                    <a:stretch>
-                      <a:fillRect/>
-                    </a:stretch>
-                  </pic:blipFill>
-                  <pic:spPr>
-                    <a:xfrm>
-                      <a:off x="0" y="0"/>
-                      <a:ext cx="4389120" cy="1692946"/>
-                    </a:xfrm>
-                    <a:prstGeom prst="rect">
-                      <a:avLst/>
-                    </a:prstGeom>
-                  </pic:spPr>
-                </pic:pic>
-              </a:graphicData>
-            </a:graphic>
-          </wp:inline>
-        </w:drawing>
-      </w:r>
-    </w:p>
-    <w:p>
-      <w:pPr>
-        <w:pStyle w:val="Caption"/>
-        <w:jc w:val="center"/>
-      </w:pPr>
-      <w:bookmarkStart w:id="6" w:name="_Toc242989754"/>
-      <w:r>
-        <w:t>Figure 1: Rating volume per year</w:t>
-      </w:r>
-      <w:bookmarkEnd w:id="6"/>
-    </w:p>
-    <w:p>
-      <w:pPr>
-        <w:jc w:val="center"/>
-      </w:pPr>
-      <w:r>
-        <w:rPr>
-          <w:noProof/>
-        </w:rPr>
-        <w:lastRenderedPageBreak/>
-        <w:drawing>
-          <wp:inline distT="0" distB="0" distL="0" distR="0" wp14:anchorId="3820C87B" wp14:editId="5CB7E116">
-            <wp:extent cx="4389120" cy="1692946"/>
-            <wp:effectExtent l="0" t="0" r="0" b="0"/>
-            <wp:docPr id="973663802" name="Picture 973663802"/>
-            <wp:cNvGraphicFramePr>
-              <a:graphicFrameLocks xmlns:a="http://schemas.openxmlformats.org/drawingml/2006/main" noChangeAspect="1"/>
-            </wp:cNvGraphicFramePr>
-            <a:graphic xmlns:a="http://schemas.openxmlformats.org/drawingml/2006/main">
-              <a:graphicData uri="http://schemas.openxmlformats.org/drawingml/2006/picture">
-                <pic:pic xmlns:pic="http://schemas.openxmlformats.org/drawingml/2006/picture">
-                  <pic:nvPicPr>
-                    <pic:cNvPr id="0" name="dist.png"/>
                     <pic:cNvPicPr/>
                   </pic:nvPicPr>
                   <pic:blipFill>
@@ -3358,11 +3331,11 @@
         <w:pStyle w:val="Caption"/>
         <w:jc w:val="center"/>
       </w:pPr>
-      <w:bookmarkStart w:id="7" w:name="_Toc242989755"/>
+      <w:bookmarkStart w:id="6" w:name="_Toc242989918"/>
       <w:r>
-        <w:t>Figure 2: Distribution of ratings</w:t>
+        <w:t>Figure 1: Rating volume per year</w:t>
       </w:r>
-      <w:bookmarkEnd w:id="7"/>
+      <w:bookmarkEnd w:id="6"/>
     </w:p>
     <w:p>
       <w:pPr>
@@ -3372,11 +3345,12 @@
         <w:rPr>
           <w:noProof/>
         </w:rPr>
+        <w:lastRenderedPageBreak/>
         <w:drawing>
-          <wp:inline distT="0" distB="0" distL="0" distR="0" wp14:anchorId="1542F0FF" wp14:editId="44241E9C">
+          <wp:inline distT="0" distB="0" distL="0" distR="0" wp14:anchorId="454A7653" wp14:editId="54AA1B67">
             <wp:extent cx="4389120" cy="1692946"/>
             <wp:effectExtent l="0" t="0" r="0" b="0"/>
-            <wp:docPr id="973663803" name="Picture 973663803"/>
+            <wp:docPr id="973663802" name="Picture 973663802"/>
             <wp:cNvGraphicFramePr>
               <a:graphicFrameLocks xmlns:a="http://schemas.openxmlformats.org/drawingml/2006/main" noChangeAspect="1"/>
             </wp:cNvGraphicFramePr>
@@ -3384,7 +3358,7 @@
               <a:graphicData uri="http://schemas.openxmlformats.org/drawingml/2006/picture">
                 <pic:pic xmlns:pic="http://schemas.openxmlformats.org/drawingml/2006/picture">
                   <pic:nvPicPr>
-                    <pic:cNvPr id="0" name="genres.png"/>
+                    <pic:cNvPr id="0" name="dist.png"/>
                     <pic:cNvPicPr/>
                   </pic:nvPicPr>
                   <pic:blipFill>
@@ -3414,7 +3388,63 @@
         <w:pStyle w:val="Caption"/>
         <w:jc w:val="center"/>
       </w:pPr>
-      <w:bookmarkStart w:id="8" w:name="_Toc242989756"/>
+      <w:bookmarkStart w:id="7" w:name="_Toc242989919"/>
+      <w:r>
+        <w:t>Figure 2: Distribution of ratings</w:t>
+      </w:r>
+      <w:bookmarkEnd w:id="7"/>
+    </w:p>
+    <w:p>
+      <w:pPr>
+        <w:jc w:val="center"/>
+      </w:pPr>
+      <w:r>
+        <w:rPr>
+          <w:noProof/>
+        </w:rPr>
+        <w:drawing>
+          <wp:inline distT="0" distB="0" distL="0" distR="0" wp14:anchorId="1CEA22AD" wp14:editId="5D40FBAC">
+            <wp:extent cx="4389120" cy="1692946"/>
+            <wp:effectExtent l="0" t="0" r="0" b="0"/>
+            <wp:docPr id="973663803" name="Picture 973663803"/>
+            <wp:cNvGraphicFramePr>
+              <a:graphicFrameLocks xmlns:a="http://schemas.openxmlformats.org/drawingml/2006/main" noChangeAspect="1"/>
+            </wp:cNvGraphicFramePr>
+            <a:graphic xmlns:a="http://schemas.openxmlformats.org/drawingml/2006/main">
+              <a:graphicData uri="http://schemas.openxmlformats.org/drawingml/2006/picture">
+                <pic:pic xmlns:pic="http://schemas.openxmlformats.org/drawingml/2006/picture">
+                  <pic:nvPicPr>
+                    <pic:cNvPr id="0" name="genres.png"/>
+                    <pic:cNvPicPr/>
+                  </pic:nvPicPr>
+                  <pic:blipFill>
+                    <a:blip r:embed="rId12"/>
+                    <a:stretch>
+                      <a:fillRect/>
+                    </a:stretch>
+                  </pic:blipFill>
+                  <pic:spPr>
+                    <a:xfrm>
+                      <a:off x="0" y="0"/>
+                      <a:ext cx="4389120" cy="1692946"/>
+                    </a:xfrm>
+                    <a:prstGeom prst="rect">
+                      <a:avLst/>
+                    </a:prstGeom>
+                  </pic:spPr>
+                </pic:pic>
+              </a:graphicData>
+            </a:graphic>
+          </wp:inline>
+        </w:drawing>
+      </w:r>
+    </w:p>
+    <w:p>
+      <w:pPr>
+        <w:pStyle w:val="Caption"/>
+        <w:jc w:val="center"/>
+      </w:pPr>
+      <w:bookmarkStart w:id="8" w:name="_Toc242989920"/>
       <w:r>
         <w:t>Figure 3: Genre popularity over time</w:t>
       </w:r>
@@ -4351,7 +4381,7 @@
         </w:rPr>
         <w:lastRenderedPageBreak/>
         <w:drawing>
-          <wp:inline distT="0" distB="0" distL="0" distR="0" wp14:anchorId="38B71473" wp14:editId="62984815">
+          <wp:inline distT="0" distB="0" distL="0" distR="0" wp14:anchorId="2103D180" wp14:editId="2A88D113">
             <wp:extent cx="4389120" cy="1692946"/>
             <wp:effectExtent l="0" t="0" r="0" b="0"/>
             <wp:docPr id="973663804" name="Picture 973663804"/>
@@ -4366,7 +4396,7 @@
                     <pic:cNvPicPr/>
                   </pic:nvPicPr>
                   <pic:blipFill>
-                    <a:blip r:embed="rId12"/>
+                    <a:blip r:embed="rId13"/>
                     <a:stretch>
                       <a:fillRect/>
                     </a:stretch>
@@ -4392,7 +4422,7 @@
         <w:pStyle w:val="Caption"/>
         <w:jc w:val="center"/>
       </w:pPr>
-      <w:bookmarkStart w:id="9" w:name="_Toc242989757"/>
+      <w:bookmarkStart w:id="9" w:name="_Toc242989921"/>
       <w:r>
         <w:t>Figure 4: ALS hyper-parameter search</w:t>
       </w:r>
@@ -4710,7 +4740,7 @@
           <w:noProof/>
         </w:rPr>
         <w:drawing>
-          <wp:inline distT="0" distB="0" distL="0" distR="0" wp14:anchorId="07123256" wp14:editId="6021C583">
+          <wp:inline distT="0" distB="0" distL="0" distR="0" wp14:anchorId="5DC99ADF" wp14:editId="1A47361B">
             <wp:extent cx="4389120" cy="3291840"/>
             <wp:effectExtent l="0" t="0" r="0" b="0"/>
             <wp:docPr id="973663805" name="Picture 973663805"/>
@@ -4725,7 +4755,7 @@
                     <pic:cNvPicPr/>
                   </pic:nvPicPr>
                   <pic:blipFill>
-                    <a:blip r:embed="rId13"/>
+                    <a:blip r:embed="rId14"/>
                     <a:stretch>
                       <a:fillRect/>
                     </a:stretch>
@@ -4751,7 +4781,7 @@
         <w:pStyle w:val="Caption"/>
         <w:jc w:val="center"/>
       </w:pPr>
-      <w:bookmarkStart w:id="10" w:name="_Toc242989758"/>
+      <w:bookmarkStart w:id="10" w:name="_Toc242989922"/>
       <w:r>
         <w:t>Figure 5: Predicted vs actual ratings on the test split</w:t>
       </w:r>
@@ -5766,7 +5796,7 @@
       <w:pPr>
         <w:pStyle w:val="Heading1"/>
       </w:pPr>
-      <w:bookmarkStart w:id="11" w:name="_Toc242989750"/>
+      <w:bookmarkStart w:id="11" w:name="_Toc242989914"/>
       <w:r>
         <w:t>6. Dashboard</w:t>
       </w:r>
@@ -6168,7 +6198,7 @@
         </w:rPr>
         <w:lastRenderedPageBreak/>
         <w:drawing>
-          <wp:inline distT="0" distB="0" distL="0" distR="0" wp14:anchorId="0AA31C3E" wp14:editId="2E7F2E59">
+          <wp:inline distT="0" distB="0" distL="0" distR="0" wp14:anchorId="38F35C29" wp14:editId="6B236D21">
             <wp:extent cx="5120640" cy="3648880"/>
             <wp:effectExtent l="0" t="0" r="0" b="0"/>
             <wp:docPr id="973663806" name="Picture 973663806"/>
@@ -6183,7 +6213,7 @@
                     <pic:cNvPicPr/>
                   </pic:nvPicPr>
                   <pic:blipFill>
-                    <a:blip r:embed="rId14"/>
+                    <a:blip r:embed="rId15"/>
                     <a:stretch>
                       <a:fillRect/>
                     </a:stretch>
@@ -6209,7 +6239,7 @@
         <w:pStyle w:val="Caption"/>
         <w:jc w:val="center"/>
       </w:pPr>
-      <w:bookmarkStart w:id="12" w:name="_Toc242989759"/>
+      <w:bookmarkStart w:id="12" w:name="_Toc242989923"/>
       <w:r>
         <w:t>Figure 6: Dashboard – Overview page</w:t>
       </w:r>
@@ -6224,7 +6254,7 @@
           <w:noProof/>
         </w:rPr>
         <w:drawing>
-          <wp:inline distT="0" distB="0" distL="0" distR="0" wp14:anchorId="6021CC2B" wp14:editId="0BA28489">
+          <wp:inline distT="0" distB="0" distL="0" distR="0" wp14:anchorId="491E7BD4" wp14:editId="31816323">
             <wp:extent cx="5120640" cy="4184682"/>
             <wp:effectExtent l="0" t="0" r="0" b="0"/>
             <wp:docPr id="973663807" name="Picture 973663807"/>
@@ -6239,7 +6269,7 @@
                     <pic:cNvPicPr/>
                   </pic:nvPicPr>
                   <pic:blipFill>
-                    <a:blip r:embed="rId15"/>
+                    <a:blip r:embed="rId16"/>
                     <a:stretch>
                       <a:fillRect/>
                     </a:stretch>
@@ -6265,7 +6295,7 @@
         <w:pStyle w:val="Caption"/>
         <w:jc w:val="center"/>
       </w:pPr>
-      <w:bookmarkStart w:id="13" w:name="_Toc242989760"/>
+      <w:bookmarkStart w:id="13" w:name="_Toc242989924"/>
       <w:r>
         <w:t>Figure 7: Dashboard – Recommendations page</w:t>
       </w:r>
@@ -6281,7 +6311,7 @@
         </w:rPr>
         <w:lastRenderedPageBreak/>
         <w:drawing>
-          <wp:inline distT="0" distB="0" distL="0" distR="0" wp14:anchorId="74C3395C" wp14:editId="007C641B">
+          <wp:inline distT="0" distB="0" distL="0" distR="0" wp14:anchorId="4BC4F780" wp14:editId="5E57D5C5">
             <wp:extent cx="5120640" cy="5195245"/>
             <wp:effectExtent l="0" t="0" r="0" b="0"/>
             <wp:docPr id="973663808" name="Picture 973663808"/>
@@ -6296,7 +6326,7 @@
                     <pic:cNvPicPr/>
                   </pic:nvPicPr>
                   <pic:blipFill>
-                    <a:blip r:embed="rId16"/>
+                    <a:blip r:embed="rId17"/>
                     <a:stretch>
                       <a:fillRect/>
                     </a:stretch>
@@ -6322,7 +6352,7 @@
         <w:pStyle w:val="Caption"/>
         <w:jc w:val="center"/>
       </w:pPr>
-      <w:bookmarkStart w:id="14" w:name="_Toc242989761"/>
+      <w:bookmarkStart w:id="14" w:name="_Toc242989925"/>
       <w:r>
         <w:t>Figure 8: Dashboard – Model quality page</w:t>
       </w:r>
@@ -6338,7 +6368,7 @@
         </w:rPr>
         <w:lastRenderedPageBreak/>
         <w:drawing>
-          <wp:inline distT="0" distB="0" distL="0" distR="0" wp14:anchorId="3F18FFA7" wp14:editId="3D148B14">
+          <wp:inline distT="0" distB="0" distL="0" distR="0" wp14:anchorId="6AB0D276" wp14:editId="1C86E84A">
             <wp:extent cx="5120640" cy="4103294"/>
             <wp:effectExtent l="0" t="0" r="0" b="0"/>
             <wp:docPr id="973663809" name="Picture 973663809"/>
@@ -6353,7 +6383,7 @@
                     <pic:cNvPicPr/>
                   </pic:nvPicPr>
                   <pic:blipFill>
-                    <a:blip r:embed="rId17"/>
+                    <a:blip r:embed="rId18"/>
                     <a:stretch>
                       <a:fillRect/>
                     </a:stretch>
@@ -6379,7 +6409,7 @@
         <w:pStyle w:val="Caption"/>
         <w:jc w:val="center"/>
       </w:pPr>
-      <w:bookmarkStart w:id="15" w:name="_Toc242989762"/>
+      <w:bookmarkStart w:id="15" w:name="_Toc242989926"/>
       <w:r>
         <w:t>Figure 9: Dashboard – Data pipeline page</w:t>
       </w:r>
@@ -6389,7 +6419,7 @@
       <w:pPr>
         <w:pStyle w:val="Heading1"/>
       </w:pPr>
-      <w:bookmarkStart w:id="16" w:name="_Toc242989751"/>
+      <w:bookmarkStart w:id="16" w:name="_Toc242989915"/>
       <w:r>
         <w:t>7. Cloud execution &amp; orchestration</w:t>
       </w:r>
@@ -7375,7 +7405,7 @@
           <w:noProof/>
         </w:rPr>
         <w:drawing>
-          <wp:inline distT="0" distB="0" distL="0" distR="0" wp14:anchorId="5828424D" wp14:editId="1B845B1E">
+          <wp:inline distT="0" distB="0" distL="0" distR="0" wp14:anchorId="7E8A162D" wp14:editId="1281BE80">
             <wp:extent cx="5120640" cy="1008961"/>
             <wp:effectExtent l="0" t="0" r="0" b="0"/>
             <wp:docPr id="973663810" name="Picture 973663810"/>
@@ -7390,7 +7420,7 @@
                     <pic:cNvPicPr/>
                   </pic:nvPicPr>
                   <pic:blipFill>
-                    <a:blip r:embed="rId18"/>
+                    <a:blip r:embed="rId19"/>
                     <a:stretch>
                       <a:fillRect/>
                     </a:stretch>
@@ -7416,7 +7446,7 @@
         <w:pStyle w:val="Caption"/>
         <w:jc w:val="center"/>
       </w:pPr>
-      <w:bookmarkStart w:id="17" w:name="_Toc242989763"/>
+      <w:bookmarkStart w:id="17" w:name="_Toc242989927"/>
       <w:r>
         <w:t>Figure 10: Google Cloud console – Dataproc jobs history</w:t>
       </w:r>
@@ -7431,7 +7461,7 @@
           <w:noProof/>
         </w:rPr>
         <w:drawing>
-          <wp:inline distT="0" distB="0" distL="0" distR="0" wp14:anchorId="3FA84AE4" wp14:editId="364DE120">
+          <wp:inline distT="0" distB="0" distL="0" distR="0" wp14:anchorId="1675FB9C" wp14:editId="4742519C">
             <wp:extent cx="5120640" cy="2556978"/>
             <wp:effectExtent l="0" t="0" r="0" b="0"/>
             <wp:docPr id="973663811" name="Picture 973663811"/>
@@ -7446,7 +7476,7 @@
                     <pic:cNvPicPr/>
                   </pic:nvPicPr>
                   <pic:blipFill>
-                    <a:blip r:embed="rId19"/>
+                    <a:blip r:embed="rId20"/>
                     <a:stretch>
                       <a:fillRect/>
                     </a:stretch>
@@ -7472,7 +7502,7 @@
         <w:pStyle w:val="Caption"/>
         <w:jc w:val="center"/>
       </w:pPr>
-      <w:bookmarkStart w:id="18" w:name="_Toc242989764"/>
+      <w:bookmarkStart w:id="18" w:name="_Toc242989928"/>
       <w:r>
         <w:t>Figure 11: Google Cloud console – GCS bucket medallion layers</w:t>
       </w:r>
@@ -7487,7 +7517,7 @@
           <w:noProof/>
         </w:rPr>
         <w:drawing>
-          <wp:inline distT="0" distB="0" distL="0" distR="0" wp14:anchorId="64C2495C" wp14:editId="0C854C3B">
+          <wp:inline distT="0" distB="0" distL="0" distR="0" wp14:anchorId="5641A184" wp14:editId="2EDE289C">
             <wp:extent cx="5120640" cy="2161412"/>
             <wp:effectExtent l="0" t="0" r="0" b="0"/>
             <wp:docPr id="973663812" name="Picture 973663812"/>
@@ -7502,7 +7532,7 @@
                     <pic:cNvPicPr/>
                   </pic:nvPicPr>
                   <pic:blipFill>
-                    <a:blip r:embed="rId20"/>
+                    <a:blip r:embed="rId21"/>
                     <a:stretch>
                       <a:fillRect/>
                     </a:stretch>
@@ -7528,7 +7558,7 @@
         <w:pStyle w:val="Caption"/>
         <w:jc w:val="center"/>
       </w:pPr>
-      <w:bookmarkStart w:id="19" w:name="_Toc242989765"/>
+      <w:bookmarkStart w:id="19" w:name="_Toc242989929"/>
       <w:r>
         <w:t>Figure 12: Google Cloud console – Billing free trial credits</w:t>
       </w:r>
@@ -7544,7 +7574,7 @@
       <w:pPr>
         <w:pStyle w:val="Heading1"/>
       </w:pPr>
-      <w:bookmarkStart w:id="20" w:name="_Toc242989752"/>
+      <w:bookmarkStart w:id="20" w:name="_Toc242989916"/>
       <w:r>
         <w:t>8. Conclusion &amp; Future Work</w:t>
       </w:r>
@@ -7559,7 +7589,7 @@
       <w:pPr>
         <w:pStyle w:val="Heading1"/>
       </w:pPr>
-      <w:bookmarkStart w:id="21" w:name="_Toc242989753"/>
+      <w:bookmarkStart w:id="21" w:name="_Toc242989917"/>
       <w:r>
         <w:t>References</w:t>
       </w:r>
@@ -7614,7 +7644,7 @@
       </w:r>
     </w:p>
     <w:sectPr>
-      <w:footerReference w:type="default" r:id="rId21"/>
+      <w:footerReference w:type="default" r:id="rId22"/>
       <w:pgSz w:w="11906" w:h="16838"/>
       <w:pgMar w:top="1440" w:right="1440" w:bottom="1440" w:left="1440" w:header="720" w:footer="720" w:gutter="0"/>
       <w:pgNumType w:start="1"/>
@@ -7874,31 +7904,31 @@
       </w:rPr>
     </w:lvl>
   </w:abstractNum>
-  <w:num w:numId="1" w16cid:durableId="610016094">
+  <w:num w:numId="1" w16cid:durableId="2018001579">
     <w:abstractNumId w:val="8"/>
   </w:num>
-  <w:num w:numId="2" w16cid:durableId="1267076491">
+  <w:num w:numId="2" w16cid:durableId="2146505898">
     <w:abstractNumId w:val="6"/>
   </w:num>
-  <w:num w:numId="3" w16cid:durableId="1146630497">
+  <w:num w:numId="3" w16cid:durableId="1148085912">
     <w:abstractNumId w:val="5"/>
   </w:num>
-  <w:num w:numId="4" w16cid:durableId="88746618">
+  <w:num w:numId="4" w16cid:durableId="796409211">
     <w:abstractNumId w:val="4"/>
   </w:num>
-  <w:num w:numId="5" w16cid:durableId="2071267589">
+  <w:num w:numId="5" w16cid:durableId="1593931993">
     <w:abstractNumId w:val="7"/>
   </w:num>
-  <w:num w:numId="6" w16cid:durableId="1888910954">
+  <w:num w:numId="6" w16cid:durableId="1782676769">
     <w:abstractNumId w:val="3"/>
   </w:num>
-  <w:num w:numId="7" w16cid:durableId="384715604">
+  <w:num w:numId="7" w16cid:durableId="1152530015">
     <w:abstractNumId w:val="2"/>
   </w:num>
-  <w:num w:numId="8" w16cid:durableId="1118993378">
+  <w:num w:numId="8" w16cid:durableId="238711617">
     <w:abstractNumId w:val="1"/>
   </w:num>
-  <w:num w:numId="9" w16cid:durableId="330762908">
+  <w:num w:numId="9" w16cid:durableId="833573212">
     <w:abstractNumId w:val="0"/>
   </w:num>
 </w:numbering>
@@ -19285,7 +19315,7 @@
     <w:autoRedefine/>
     <w:uiPriority w:val="39"/>
     <w:unhideWhenUsed/>
-    <w:rsid w:val="00EF2B21"/>
+    <w:rsid w:val="00C6375F"/>
     <w:pPr>
       <w:spacing w:after="100"/>
     </w:pPr>
@@ -19295,7 +19325,7 @@
     <w:basedOn w:val="DefaultParagraphFont"/>
     <w:uiPriority w:val="99"/>
     <w:unhideWhenUsed/>
-    <w:rsid w:val="00EF2B21"/>
+    <w:rsid w:val="00C6375F"/>
     <w:rPr>
       <w:color w:val="0000FF" w:themeColor="hyperlink"/>
       <w:u w:val="single"/>

</xml_diff>